<commit_message>
all three api implementations
</commit_message>
<xml_diff>
--- a/backend/NEXICODE_JavaScript_Question_Bank.docx
+++ b/backend/NEXICODE_JavaScript_Question_Bank.docx
@@ -6180,6 +6180,7 @@
       <w:pPr>
         <w:rPr>
           <w:iCs/>
+          <w:color w:val="000000"/>
         </w:rPr>
       </w:pPr>
       <w:r>
@@ -6189,6 +6190,41 @@
         </w:rPr>
         <w:t>Creating an array is trivial; using it correctly is not. I placed a clear gap between mark 2 (array created, nothing done with it) and the middle marks, because simply declaring an array demonstrates almost nothing about a student's understanding of iteration. The more revealing distinction, in my judgement, is at mark 6: the student loops and formats output correctly but starts numbering from 0 instead of 1 a classic off-by-one indexing error that shows they understand the loop mechanism but have not thought about how array indices map onto a human-readable position number.</w:t>
       </w:r>
+      <w:r>
+        <w:rPr>
+          <w:sz w:val="24"/>
+          <w:szCs w:val="24"/>
+        </w:rPr>
+        <w:t xml:space="preserve"> </w:t>
+      </w:r>
+      <w:r>
+        <w:rPr>
+          <w:iCs/>
+          <w:color w:val="000000"/>
+        </w:rPr>
+        <w:t>When tested against Claude, this question produced the highest average marking error of all ten questions (2.20). I suspect this is because the off-by-one indexing boundary at mark 6, and the correct-but-</w:t>
+      </w:r>
+      <w:r>
+        <w:rPr>
+          <w:iCs/>
+          <w:color w:val="000000"/>
+        </w:rPr>
+        <w:t>unlabeled</w:t>
+      </w:r>
+      <w:r>
+        <w:rPr>
+          <w:iCs/>
+          <w:color w:val="000000"/>
+        </w:rPr>
+        <w:t>-output boundary around marks 4–5, are easy for a human marker to distinguish by eye but harder for an AI model to judge with consistent precision the difference often comes down to a single index number changing inside a loop condition, rather than a structural difference in the code, which is a subtler signal for a model to catch reliably across many similarly-shaped loops.</w:t>
+      </w:r>
+    </w:p>
+    <w:p>
+      <w:pPr>
+        <w:rPr>
+          <w:iCs/>
+        </w:rPr>
+      </w:pPr>
     </w:p>
     <w:p/>
     <w:p>
@@ -6933,7 +6969,17 @@
                 <w:sz w:val="18"/>
                 <w:szCs w:val="18"/>
               </w:rPr>
-              <w:t xml:space="preserve">(score =&gt; score &gt;= 50); console.log("Original scores:", scores); console.log("Passing scores:", </w:t>
+              <w:t xml:space="preserve">(score =&gt; score &gt;= 50); </w:t>
+            </w:r>
+            <w:r>
+              <w:rPr>
+                <w:rFonts w:ascii="Courier New" w:eastAsia="Courier New" w:hAnsi="Courier New" w:cs="Courier New"/>
+                <w:color w:val="000000"/>
+                <w:sz w:val="18"/>
+                <w:szCs w:val="18"/>
+              </w:rPr>
+              <w:lastRenderedPageBreak/>
+              <w:t xml:space="preserve">console.log("Original scores:", scores); console.log("Passing scores:", </w:t>
             </w:r>
             <w:proofErr w:type="spellStart"/>
             <w:r>
@@ -6970,6 +7016,7 @@
                 <w:b/>
                 <w:bCs/>
               </w:rPr>
+              <w:lastRenderedPageBreak/>
               <w:t>9/10</w:t>
             </w:r>
           </w:p>
@@ -7060,17 +7107,7 @@
                 <w:sz w:val="18"/>
                 <w:szCs w:val="18"/>
               </w:rPr>
-              <w:t xml:space="preserve">); </w:t>
-            </w:r>
-            <w:r>
-              <w:rPr>
-                <w:rFonts w:ascii="Courier New" w:eastAsia="Courier New" w:hAnsi="Courier New" w:cs="Courier New"/>
-                <w:color w:val="000000"/>
-                <w:sz w:val="18"/>
-                <w:szCs w:val="18"/>
-              </w:rPr>
-              <w:lastRenderedPageBreak/>
-              <w:t xml:space="preserve">console.log("Number of passing students:", </w:t>
+              <w:t xml:space="preserve">); console.log("Number of passing students:", </w:t>
             </w:r>
             <w:proofErr w:type="spellStart"/>
             <w:r>
@@ -7107,7 +7144,6 @@
                 <w:b/>
                 <w:bCs/>
               </w:rPr>
-              <w:lastRenderedPageBreak/>
               <w:t>10/10</w:t>
             </w:r>
           </w:p>
@@ -7735,6 +7771,7 @@
                 <w:b/>
                 <w:bCs/>
               </w:rPr>
+              <w:lastRenderedPageBreak/>
               <w:t>5/10</w:t>
             </w:r>
           </w:p>
@@ -7848,17 +7885,7 @@
                 <w:sz w:val="18"/>
                 <w:szCs w:val="18"/>
               </w:rPr>
-              <w:t xml:space="preserve">const student = {   name: "Nick",   age: 21,   course: "Software Engineering",   introduce() {     </w:t>
-            </w:r>
-            <w:r>
-              <w:rPr>
-                <w:rFonts w:ascii="Courier New" w:eastAsia="Courier New" w:hAnsi="Courier New" w:cs="Courier New"/>
-                <w:color w:val="000000"/>
-                <w:sz w:val="18"/>
-                <w:szCs w:val="18"/>
-              </w:rPr>
-              <w:lastRenderedPageBreak/>
-              <w:t xml:space="preserve">console.log("Hi, I am " + this.name);   } }; </w:t>
+              <w:t xml:space="preserve">const student = {   name: "Nick",   age: 21,   course: "Software Engineering",   introduce() {     console.log("Hi, I am " + this.name);   } }; </w:t>
             </w:r>
             <w:proofErr w:type="spellStart"/>
             <w:r>
@@ -7895,7 +7922,6 @@
                 <w:b/>
                 <w:bCs/>
               </w:rPr>
-              <w:lastRenderedPageBreak/>
               <w:t>7/10</w:t>
             </w:r>
           </w:p>
@@ -9928,23 +9954,21 @@
           <w:iCs/>
           <w:color w:val="000000"/>
         </w:rPr>
-        <w:t xml:space="preserve">This is the question where I would expect an AI marker to </w:t>
-      </w:r>
-      <w:proofErr w:type="gramStart"/>
+        <w:t xml:space="preserve">My mark 7 answer is functionally </w:t>
+      </w:r>
       <w:r>
         <w:rPr>
           <w:iCs/>
           <w:color w:val="000000"/>
         </w:rPr>
-        <w:t>struggle</w:t>
-      </w:r>
-      <w:proofErr w:type="gramEnd"/>
+        <w:t>complete</w:t>
+      </w:r>
       <w:r>
         <w:rPr>
           <w:iCs/>
           <w:color w:val="000000"/>
         </w:rPr>
-        <w:t xml:space="preserve"> most, and the results against Claude bore that out. My mark 7 answer is functionally </w:t>
+        <w:t xml:space="preserve"> filters correctly and prints the resulting array with a single </w:t>
       </w:r>
       <w:proofErr w:type="gramStart"/>
       <w:r>
@@ -9952,7 +9976,7 @@
           <w:iCs/>
           <w:color w:val="000000"/>
         </w:rPr>
-        <w:t>complete it</w:t>
+        <w:t>console.log(</w:t>
       </w:r>
       <w:proofErr w:type="gramEnd"/>
       <w:r>
@@ -9960,79 +9984,22 @@
           <w:iCs/>
           <w:color w:val="000000"/>
         </w:rPr>
-        <w:t xml:space="preserve"> filters correctly and prints the resulting array with a single </w:t>
-      </w:r>
-      <w:proofErr w:type="gramStart"/>
+        <w:t xml:space="preserve">) call but the output is an unformatted dump of raw objects. Mark 8 introduces a loop that prints each student individually, and </w:t>
+      </w:r>
       <w:r>
         <w:rPr>
           <w:iCs/>
           <w:color w:val="000000"/>
         </w:rPr>
-        <w:t>console.log(</w:t>
-      </w:r>
-      <w:proofErr w:type="gramEnd"/>
+        <w:t>marks</w:t>
+      </w:r>
       <w:r>
         <w:rPr>
           <w:iCs/>
           <w:color w:val="000000"/>
         </w:rPr>
-        <w:t xml:space="preserve">) call but the output is an unformatted dump of raw objects. Mark 8 introduces a loop that prints each student individually, and mark 9 adds labelled, formatted output (“Nick: 85”) rather than the raw object shape. The distinction between 7 and 9 is therefore not about correctness at all both answers return exactly the right </w:t>
-      </w:r>
-      <w:proofErr w:type="gramStart"/>
-      <w:r>
-        <w:rPr>
-          <w:iCs/>
-          <w:color w:val="000000"/>
-        </w:rPr>
-        <w:t>data  it</w:t>
-      </w:r>
-      <w:proofErr w:type="gramEnd"/>
-      <w:r>
-        <w:rPr>
-          <w:iCs/>
-          <w:color w:val="000000"/>
-        </w:rPr>
-        <w:t xml:space="preserve"> is about presentation quality, which is a more subjective judgement than checking whether a filter condition is right or wrong. I suspect this is exactly the kind of boundary an AI model, trained to </w:t>
-      </w:r>
-      <w:proofErr w:type="spellStart"/>
-      <w:r>
-        <w:rPr>
-          <w:iCs/>
-          <w:color w:val="000000"/>
-        </w:rPr>
-        <w:t>prioritise</w:t>
-      </w:r>
-      <w:proofErr w:type="spellEnd"/>
-      <w:r>
-        <w:rPr>
-          <w:iCs/>
-          <w:color w:val="000000"/>
-        </w:rPr>
-        <w:t xml:space="preserve"> functional correctness, would tend to under-</w:t>
-      </w:r>
-      <w:proofErr w:type="spellStart"/>
-      <w:r>
-        <w:rPr>
-          <w:iCs/>
-          <w:color w:val="000000"/>
-        </w:rPr>
-        <w:t>penalise</w:t>
-      </w:r>
-      <w:proofErr w:type="spellEnd"/>
-      <w:r>
-        <w:rPr>
-          <w:iCs/>
-          <w:color w:val="000000"/>
-        </w:rPr>
-        <w:t xml:space="preserve"> or score more generously than a human marker would, which is a plausible explanation for the higher error rate on this question.</w:t>
-      </w:r>
-    </w:p>
-    <w:p>
-      <w:pPr>
-        <w:rPr>
-          <w:iCs/>
-        </w:rPr>
-      </w:pPr>
+        <w:t xml:space="preserve"> 9 adds labelled, formatted output ("Nick: 85") rather than the raw object shape. The distinction between 7 and 9 is therefore not about correctness at all both answers return exactly the right data it is about presentation quality: whether the output is dumped raw or formatted for a human reader. Interestingly, when this question was tested against Claude, it produced one of the lowest average marking errors of the ten questions (0.70), suggesting the rubric's language around "labelled output" was specific enough for the model to apply consistently, even though the underlying judgement is inherently more subjective than checking whether a filter condition is right or wrong.</w:t>
+      </w:r>
       <w:r>
         <w:rPr>
           <w:iCs/>
@@ -14294,7 +14261,6 @@
   <w:style w:type="character" w:default="1" w:styleId="DefaultParagraphFont">
     <w:name w:val="Default Paragraph Font"/>
     <w:uiPriority w:val="1"/>
-    <w:semiHidden/>
     <w:unhideWhenUsed/>
   </w:style>
   <w:style w:type="table" w:default="1" w:styleId="TableNormal">
@@ -14412,6 +14378,18 @@
     <w:rPr>
       <w:color w:val="000000"/>
       <w:shd w:val="clear" w:color="auto" w:fill="FFFFFF"/>
+    </w:rPr>
+  </w:style>
+  <w:style w:type="paragraph" w:styleId="NormalWeb">
+    <w:name w:val="Normal (Web)"/>
+    <w:basedOn w:val="Normal"/>
+    <w:uiPriority w:val="99"/>
+    <w:semiHidden/>
+    <w:unhideWhenUsed/>
+    <w:rsid w:val="006E5B02"/>
+    <w:rPr>
+      <w:sz w:val="24"/>
+      <w:szCs w:val="24"/>
     </w:rPr>
   </w:style>
 </w:styles>

</xml_diff>